<commit_message>
Vol 3: word-choice, gentleness, structural, and cadence passes
Reduces easily-avoided word repetition; adds felt grounding for
jargon terms across all 17 chapters; strengthens honesty notes on
the gauge-symmetry metaphor and strand-model mechanism (Ch12); adds
a worked E=mc^2 number (Ch1) and a Ch15-Ch17 cross-reference; fixes
flat fragment-list cadence in three passages. Applies matching fixes
to the illustration/cover prompts doc.

Co-Authored-By: Claude Sonnet 5 <noreply@anthropic.com>
</commit_message>
<xml_diff>
--- a/Science Books/Physics/Volume 3/Vol 3 - Illustration and Cover Prompts.docx
+++ b/Science Books/Physics/Volume 3/Vol 3 - Illustration and Cover Prompts.docx
@@ -259,7 +259,7 @@
           <w:b w:val="0"/>
           <w:i w:val="0"/>
         </w:rPr>
-        <w:t>The nucleus is almost unimaginably small, yet it holds forces strong enough to power stars, release nuclear energy, and explain radioactive decay — all built from quarks bound by the strong interaction.</w:t>
+        <w:t>The nucleus is almost unimaginably small, yet it holds forces strong enough to power stars, release nuclear energy, and explain radioactive decay — all built from quarks bound by the strong interaction, the short-range force that beats electric repulsion at point-blank range.</w:t>
       </w:r>
     </w:p>
     <w:p>
@@ -1371,7 +1371,7 @@
           <w:b w:val="0"/>
           <w:i w:val="0"/>
         </w:rPr>
-        <w:t>Replace point particles with tiny vibrating strings, and different vibration patterns become different particles — including, unexpectedly, one with the properties expected of the graviton. The catch: it only works in ten dimensions, and no superpartner has been confirmed.</w:t>
+        <w:t>Replace point particles with tiny vibrating strings, and different vibration patterns become different particles — including, unexpectedly, one that behaves exactly like the graviton, physics' hoped-for carrier of gravity. The catch: it only works in ten dimensions, and no predicted partner particle has ever been confirmed.</w:t>
       </w:r>
     </w:p>
     <w:p>
@@ -1788,7 +1788,7 @@
           <w:b w:val="0"/>
           <w:i w:val="0"/>
         </w:rPr>
-        <w:t>Gauge symmetry already organizes the Standard Model's forces with remarkable success. The strand model, physicist Christoph Schiller's speculative proposal, bets this structure could emerge from strand crossings and twisting — a beautiful possibility that still has to survive the same test every theory does.</w:t>
+        <w:t>Gauge symmetry — the hidden rulebook behind how the forces are built — already organizes the Standard Model's forces with remarkable success. The strand model, physicist Christoph Schiller's speculative proposal, bets this structure could emerge from strand crossings and twisting — a beautiful possibility that still has to survive the same test every theory does.</w:t>
       </w:r>
     </w:p>
     <w:p>

</xml_diff>